<commit_message>
Add historical reserve counterfactual and bounded scaling study
</commit_message>
<xml_diff>
--- a/paper/Shorya_Jaiswal_Revised_Research_Paper.docx
+++ b/paper/Shorya_Jaiswal_Revised_Research_Paper.docx
@@ -6,6 +6,9 @@
       <w:pPr>
         <w:pStyle w:val="Title"/>
         <w:jc w:val="center"/>
+        <w:pBdr>
+          <w:bottom w:val="nil"/>
+        </w:pBdr>
       </w:pPr>
       <w:r>
         <w:t>Economic Invariant Analysis of a Single Transaction DeFi Flash Loan Model</w:t>
@@ -16,7 +19,15 @@
         <w:jc w:val="center"/>
       </w:pPr>
       <w:r>
-        <w:t>Shorya Jaiswal  |  Independent researcher</w:t>
+        <w:t>Shorya Jaiswal  |  Symbiosis International University (Symbiosis Artificial Intelligence Institute)</w:t>
+      </w:r>
+    </w:p>
+    <w:p>
+      <w:pPr>
+        <w:jc w:val="center"/>
+      </w:pPr>
+      <w:r>
+        <w:t>shoryajkt@gmail.com</w:t>
       </w:r>
     </w:p>
     <w:p>
@@ -38,7 +49,7 @@
     <w:p>
       <w:pPr/>
       <w:r>
-        <w:t>A flash loan can temporarily distort the price seen by a lending protocol even when the trading pool returns to its initial reserves. This paper studies a bounded, fee-free constant-product automated market maker (AMM) coupled to a lender that accepts a manipulated spot price. The attacker pledges pre-owned collateral, borrows against the distorted price, reverses the AMM trade, repays the flash loan, and forfeits collateral under an explicit non-recourse settlement assumption. We derive an exact finite-candidate test for profitable extraction, a sufficient reserve-depth threshold, and conditional defenses based on bounded oracle prices and dynamic loan-to-value ratios. A Python/Z3 model searches for counterexamples; the analytical test independently classifies all 90 synthetic parameter settings, each checked three times by Z3. The recorded sweep has 204 SAT and 66 UNSAT solver calls with no UNKNOWN results. These are model-level results: the work does not establish security of deployed contracts or replay historical transactions.</w:t>
+        <w:t>A flash loan can temporarily distort the price seen by a lending protocol even when the trading pool returns to its initial reserves. This paper studies a bounded, fee-free constant-product automated market maker (AMM) coupled to a lender that accepts a manipulated spot price. The attacker pledges pre-owned collateral, borrows against the distorted price, reverses the AMM trade, repays the flash loan, and forfeits collateral under an explicit non-recourse settlement assumption. We derive an exact finite-candidate test for profitable extraction, a sufficient reserve-depth threshold, and conditional defenses based on bounded oracle prices and dynamic loan-to-value ratios. A Python/Z3 model searches for counterexamples; the analytical test agrees with all 90 synthetic parameter settings. A separate counterfactual uses rounded AMM reserves reported for a February 2020 bZx transaction; it is not a replay of that transaction. An auxiliary conservation experiment measures solver behavior for 1–32 distinct symbolic pools. These model-level results do not establish security of deployed contracts.</w:t>
       </w:r>
     </w:p>
     <w:p>
@@ -814,7 +825,7 @@
     <w:p>
       <w:pPr/>
       <w:r>
-        <w:t>The bZx-inspired example isolates transient spot-price inflation before lending [1]. The Harvest proxy uses two independent constant-product pools to perturb a vault valuation, then checks fee-net share redemption; the corrected proxy mints shares from true assets [12]. The Euler proxy asks whether a donation can cause an unhealthy collateral position; a post-donation health check blocks that transition [13]. These simplified examples capture different failure mechanisms. They are not historical transaction replays, and the Euler SAT result concerns health reachability rather than profit.</w:t>
+        <w:t>The bZx-inspired example isolates transient spot-price inflation before lending [1]. A reserve-calibrated counterfactual based on the historical Uniswap sUSD/ETH pool is reported in Section 7.3. The Harvest proxy uses two independent constant-product pools to perturb a vault valuation, then checks fee-net share redemption; the corrected proxy mints shares from true assets [12]. The Euler proxy asks whether a donation can cause an unhealthy collateral position; a post-donation health check blocks that transition [13]. These simplified examples capture different failure mechanisms. They are not historical transaction replays, and the Euler SAT result concerns health reachability rather than profit.</w:t>
       </w:r>
     </w:p>
     <w:p>
@@ -1188,7 +1199,7 @@
     <w:p>
       <w:pPr/>
       <w:r>
-        <w:t>This is a method and scope comparison based on the cited publications, not a matched runtime benchmark against those tools. A controlled tool comparison would need compatible protocol semantics and common historical states. Formal AMM models and oracle research likewise predate this work [6–8].</w:t>
+        <w:t>FlashSyn provides an executable research artifact with a bZx1 benchmark [14]. Its authors specify a Linux/Docker setup and note that the artifact is not supported on Windows. The present experiment uses a preselected, fee-free swap–lend–reverse schedule and a non-recourse settlement rule; FlashSyn synthesizes action sequences against its own benchmark semantics. Thus a direct agreement or speed comparison would require porting one common model and state into both tools. The comparison here is methodological and reproducibility-focused, not a matched runtime claim. Formal AMM models and oracle research likewise predate this work [6–8].</w:t>
       </w:r>
     </w:p>
     <w:p>
@@ -2415,6 +2426,1030 @@
     </w:p>
     <w:p>
       <w:pPr>
+        <w:pStyle w:val="Heading2"/>
+      </w:pPr>
+      <w:r>
+        <w:t>7.3 Case calibrated to published historical reserves</w:t>
+      </w:r>
+    </w:p>
+    <w:p>
+      <w:pPr/>
+      <w:r>
+        <w:t>Qin et al. report that the Uniswap sUSD/ETH pool held 243,441.12 sUSD and 879.76 ETH immediately before the February 2020 bZx oracle manipulation; 540 ETH was sent to that pool, after which its reported reserves were 151,021.42 sUSD and 1,419.76 ETH [1, Fig. 4]. These are rounded published figures, not values independently fetched from an archive node. We set x and y to the reported starting reserves and F to the reported 540 ETH pool input. The hypothetical lender instead uses pre-owned C = 100,000 sUSD, L = 0.75, T = 500 ETH, and r = 0.0009. Those four quantities are scenario assumptions, not historical bZx parameters.</w:t>
+      </w:r>
+    </w:p>
+    <w:p>
+      <w:pPr>
+        <w:spacing w:after="100"/>
+        <w:jc w:val="center"/>
+      </w:pPr>
+      <w:r>
+        <w:rPr>
+          <w:i/>
+          <w:color w:val="46525D"/>
+          <w:sz w:val="17"/>
+        </w:rPr>
+        <w:t>Table 5. Published pool reserves and a fee-free model counterfactual.</w:t>
+      </w:r>
+    </w:p>
+    <w:tbl>
+      <w:tblPr>
+        <w:tblStyle w:val="TableGrid"/>
+        <w:tblW w:type="auto" w:w="0"/>
+        <w:jc w:val="center"/>
+        <w:tblLook w:firstColumn="1" w:firstRow="1" w:lastColumn="0" w:lastRow="0" w:noHBand="0" w:noVBand="1" w:val="04A0"/>
+      </w:tblPr>
+      <w:tblGrid>
+        <w:gridCol w:w="3293"/>
+        <w:gridCol w:w="3293"/>
+        <w:gridCol w:w="3293"/>
+      </w:tblGrid>
+      <w:tr>
+        <w:tc>
+          <w:tcPr>
+            <w:tcW w:type="dxa" w:w="2880"/>
+            <w:shd w:fill="E7EFF3"/>
+          </w:tcPr>
+          <w:p>
+            <w:r>
+              <w:rPr>
+                <w:b/>
+                <w:color w:val="17324D"/>
+                <w:sz w:val="17"/>
+              </w:rPr>
+              <w:t>Quantity</w:t>
+            </w:r>
+          </w:p>
+        </w:tc>
+        <w:tc>
+          <w:tcPr>
+            <w:tcW w:type="dxa" w:w="3096"/>
+            <w:shd w:fill="E7EFF3"/>
+          </w:tcPr>
+          <w:p>
+            <w:r>
+              <w:rPr>
+                <w:b/>
+                <w:color w:val="17324D"/>
+                <w:sz w:val="17"/>
+              </w:rPr>
+              <w:t>Published bZx pool [1]</w:t>
+            </w:r>
+          </w:p>
+        </w:tc>
+        <w:tc>
+          <w:tcPr>
+            <w:tcW w:type="dxa" w:w="3816"/>
+            <w:shd w:fill="E7EFF3"/>
+          </w:tcPr>
+          <w:p>
+            <w:r>
+              <w:rPr>
+                <w:b/>
+                <w:color w:val="17324D"/>
+                <w:sz w:val="17"/>
+              </w:rPr>
+              <w:t>This model</w:t>
+            </w:r>
+          </w:p>
+        </w:tc>
+      </w:tr>
+      <w:tr>
+        <w:tc>
+          <w:tcPr>
+            <w:tcW w:type="dxa" w:w="2880"/>
+            <w:vAlign w:val="center"/>
+          </w:tcPr>
+          <w:p>
+            <w:pPr>
+              <w:spacing w:after="40" w:before="40"/>
+            </w:pPr>
+            <w:r>
+              <w:rPr>
+                <w:rFonts w:ascii="Times New Roman" w:hAnsi="Times New Roman"/>
+                <w:sz w:val="16"/>
+              </w:rPr>
+              <w:t>Initial sUSD / ETH</w:t>
+            </w:r>
+          </w:p>
+        </w:tc>
+        <w:tc>
+          <w:tcPr>
+            <w:tcW w:type="dxa" w:w="3096"/>
+            <w:vAlign w:val="center"/>
+          </w:tcPr>
+          <w:p>
+            <w:pPr>
+              <w:spacing w:after="40" w:before="40"/>
+            </w:pPr>
+            <w:r>
+              <w:rPr>
+                <w:rFonts w:ascii="Times New Roman" w:hAnsi="Times New Roman"/>
+                <w:sz w:val="16"/>
+              </w:rPr>
+              <w:t>243,441.12 / 879.76</w:t>
+            </w:r>
+          </w:p>
+        </w:tc>
+        <w:tc>
+          <w:tcPr>
+            <w:tcW w:type="dxa" w:w="3816"/>
+            <w:vAlign w:val="center"/>
+          </w:tcPr>
+          <w:p>
+            <w:pPr>
+              <w:spacing w:after="40" w:before="40"/>
+            </w:pPr>
+            <w:r>
+              <w:rPr>
+                <w:rFonts w:ascii="Times New Roman" w:hAnsi="Times New Roman"/>
+                <w:sz w:val="16"/>
+              </w:rPr>
+              <w:t>Same starting reserves</w:t>
+            </w:r>
+          </w:p>
+        </w:tc>
+      </w:tr>
+      <w:tr>
+        <w:tc>
+          <w:tcPr>
+            <w:tcW w:type="dxa" w:w="2880"/>
+            <w:vAlign w:val="center"/>
+            <w:shd w:fill="F7FAFB"/>
+          </w:tcPr>
+          <w:p>
+            <w:pPr>
+              <w:spacing w:after="40" w:before="40"/>
+            </w:pPr>
+            <w:r>
+              <w:rPr>
+                <w:rFonts w:ascii="Times New Roman" w:hAnsi="Times New Roman"/>
+                <w:sz w:val="16"/>
+              </w:rPr>
+              <w:t>Input to pool</w:t>
+            </w:r>
+          </w:p>
+        </w:tc>
+        <w:tc>
+          <w:tcPr>
+            <w:tcW w:type="dxa" w:w="3096"/>
+            <w:vAlign w:val="center"/>
+            <w:shd w:fill="F7FAFB"/>
+          </w:tcPr>
+          <w:p>
+            <w:pPr>
+              <w:spacing w:after="40" w:before="40"/>
+            </w:pPr>
+            <w:r>
+              <w:rPr>
+                <w:rFonts w:ascii="Times New Roman" w:hAnsi="Times New Roman"/>
+                <w:sz w:val="16"/>
+              </w:rPr>
+              <w:t>540 ETH</w:t>
+            </w:r>
+          </w:p>
+        </w:tc>
+        <w:tc>
+          <w:tcPr>
+            <w:tcW w:type="dxa" w:w="3816"/>
+            <w:vAlign w:val="center"/>
+            <w:shd w:fill="F7FAFB"/>
+          </w:tcPr>
+          <w:p>
+            <w:pPr>
+              <w:spacing w:after="40" w:before="40"/>
+            </w:pPr>
+            <w:r>
+              <w:rPr>
+                <w:rFonts w:ascii="Times New Roman" w:hAnsi="Times New Roman"/>
+                <w:sz w:val="16"/>
+              </w:rPr>
+              <w:t>F = 540 ETH</w:t>
+            </w:r>
+          </w:p>
+        </w:tc>
+      </w:tr>
+      <w:tr>
+        <w:tc>
+          <w:tcPr>
+            <w:tcW w:type="dxa" w:w="2880"/>
+            <w:vAlign w:val="center"/>
+          </w:tcPr>
+          <w:p>
+            <w:pPr>
+              <w:spacing w:after="40" w:before="40"/>
+            </w:pPr>
+            <w:r>
+              <w:rPr>
+                <w:rFonts w:ascii="Times New Roman" w:hAnsi="Times New Roman"/>
+                <w:sz w:val="16"/>
+              </w:rPr>
+              <w:t>sUSD after input</w:t>
+            </w:r>
+          </w:p>
+        </w:tc>
+        <w:tc>
+          <w:tcPr>
+            <w:tcW w:type="dxa" w:w="3096"/>
+            <w:vAlign w:val="center"/>
+          </w:tcPr>
+          <w:p>
+            <w:pPr>
+              <w:spacing w:after="40" w:before="40"/>
+            </w:pPr>
+            <w:r>
+              <w:rPr>
+                <w:rFonts w:ascii="Times New Roman" w:hAnsi="Times New Roman"/>
+                <w:sz w:val="16"/>
+              </w:rPr>
+              <w:t>151,021.42</w:t>
+            </w:r>
+          </w:p>
+        </w:tc>
+        <w:tc>
+          <w:tcPr>
+            <w:tcW w:type="dxa" w:w="3816"/>
+            <w:vAlign w:val="center"/>
+          </w:tcPr>
+          <w:p>
+            <w:pPr>
+              <w:spacing w:after="40" w:before="40"/>
+            </w:pPr>
+            <w:r>
+              <w:rPr>
+                <w:rFonts w:ascii="Times New Roman" w:hAnsi="Times New Roman"/>
+                <w:sz w:val="16"/>
+              </w:rPr>
+              <w:t>150,849.27</w:t>
+            </w:r>
+          </w:p>
+        </w:tc>
+      </w:tr>
+      <w:tr>
+        <w:tc>
+          <w:tcPr>
+            <w:tcW w:type="dxa" w:w="2880"/>
+            <w:vAlign w:val="center"/>
+            <w:shd w:fill="F7FAFB"/>
+          </w:tcPr>
+          <w:p>
+            <w:pPr>
+              <w:spacing w:after="40" w:before="40"/>
+            </w:pPr>
+            <w:r>
+              <w:rPr>
+                <w:rFonts w:ascii="Times New Roman" w:hAnsi="Times New Roman"/>
+                <w:sz w:val="16"/>
+              </w:rPr>
+              <w:t>sUSD paid out</w:t>
+            </w:r>
+          </w:p>
+        </w:tc>
+        <w:tc>
+          <w:tcPr>
+            <w:tcW w:type="dxa" w:w="3096"/>
+            <w:vAlign w:val="center"/>
+            <w:shd w:fill="F7FAFB"/>
+          </w:tcPr>
+          <w:p>
+            <w:pPr>
+              <w:spacing w:after="40" w:before="40"/>
+            </w:pPr>
+            <w:r>
+              <w:rPr>
+                <w:rFonts w:ascii="Times New Roman" w:hAnsi="Times New Roman"/>
+                <w:sz w:val="16"/>
+              </w:rPr>
+              <w:t>92,419.70</w:t>
+            </w:r>
+          </w:p>
+        </w:tc>
+        <w:tc>
+          <w:tcPr>
+            <w:tcW w:type="dxa" w:w="3816"/>
+            <w:vAlign w:val="center"/>
+            <w:shd w:fill="F7FAFB"/>
+          </w:tcPr>
+          <w:p>
+            <w:pPr>
+              <w:spacing w:after="40" w:before="40"/>
+            </w:pPr>
+            <w:r>
+              <w:rPr>
+                <w:rFonts w:ascii="Times New Roman" w:hAnsi="Times New Roman"/>
+                <w:sz w:val="16"/>
+              </w:rPr>
+              <w:t>92,591.85</w:t>
+            </w:r>
+          </w:p>
+        </w:tc>
+      </w:tr>
+      <w:tr>
+        <w:tc>
+          <w:tcPr>
+            <w:tcW w:type="dxa" w:w="2880"/>
+            <w:vAlign w:val="center"/>
+          </w:tcPr>
+          <w:p>
+            <w:pPr>
+              <w:spacing w:after="40" w:before="40"/>
+            </w:pPr>
+            <w:r>
+              <w:rPr>
+                <w:rFonts w:ascii="Times New Roman" w:hAnsi="Times New Roman"/>
+                <w:sz w:val="16"/>
+              </w:rPr>
+              <w:t>Collateral, LTV, cash, flash fee</w:t>
+            </w:r>
+          </w:p>
+        </w:tc>
+        <w:tc>
+          <w:tcPr>
+            <w:tcW w:type="dxa" w:w="3096"/>
+            <w:vAlign w:val="center"/>
+          </w:tcPr>
+          <w:p>
+            <w:pPr>
+              <w:spacing w:after="40" w:before="40"/>
+            </w:pPr>
+            <w:r>
+              <w:rPr>
+                <w:rFonts w:ascii="Times New Roman" w:hAnsi="Times New Roman"/>
+                <w:sz w:val="16"/>
+              </w:rPr>
+              <w:t>Different historical mechanism</w:t>
+            </w:r>
+          </w:p>
+        </w:tc>
+        <w:tc>
+          <w:tcPr>
+            <w:tcW w:type="dxa" w:w="3816"/>
+            <w:vAlign w:val="center"/>
+          </w:tcPr>
+          <w:p>
+            <w:pPr>
+              <w:spacing w:after="40" w:before="40"/>
+            </w:pPr>
+            <w:r>
+              <w:rPr>
+                <w:rFonts w:ascii="Times New Roman" w:hAnsi="Times New Roman"/>
+                <w:sz w:val="16"/>
+              </w:rPr>
+              <w:t>100,000 sUSD; 0.75; 500 ETH; 0.0009</w:t>
+            </w:r>
+          </w:p>
+        </w:tc>
+      </w:tr>
+      <w:tr>
+        <w:tc>
+          <w:tcPr>
+            <w:tcW w:type="dxa" w:w="2880"/>
+            <w:vAlign w:val="center"/>
+            <w:shd w:fill="F7FAFB"/>
+          </w:tcPr>
+          <w:p>
+            <w:pPr>
+              <w:spacing w:after="40" w:before="40"/>
+            </w:pPr>
+            <w:r>
+              <w:rPr>
+                <w:rFonts w:ascii="Times New Roman" w:hAnsi="Times New Roman"/>
+                <w:sz w:val="16"/>
+              </w:rPr>
+              <w:t>Modeled gain at f = 540</w:t>
+            </w:r>
+          </w:p>
+        </w:tc>
+        <w:tc>
+          <w:tcPr>
+            <w:tcW w:type="dxa" w:w="3096"/>
+            <w:vAlign w:val="center"/>
+            <w:shd w:fill="F7FAFB"/>
+          </w:tcPr>
+          <w:p>
+            <w:pPr>
+              <w:spacing w:after="40" w:before="40"/>
+            </w:pPr>
+            <w:r>
+              <w:rPr>
+                <w:rFonts w:ascii="Times New Roman" w:hAnsi="Times New Roman"/>
+                <w:sz w:val="16"/>
+              </w:rPr>
+              <w:t>Not comparable to historical proceeds</w:t>
+            </w:r>
+          </w:p>
+        </w:tc>
+        <w:tc>
+          <w:tcPr>
+            <w:tcW w:type="dxa" w:w="3816"/>
+            <w:vAlign w:val="center"/>
+            <w:shd w:fill="F7FAFB"/>
+          </w:tcPr>
+          <w:p>
+            <w:pPr>
+              <w:spacing w:after="40" w:before="40"/>
+            </w:pPr>
+            <w:r>
+              <w:rPr>
+                <w:rFonts w:ascii="Times New Roman" w:hAnsi="Times New Roman"/>
+                <w:sz w:val="16"/>
+              </w:rPr>
+              <w:t>138.129 ETH</w:t>
+            </w:r>
+          </w:p>
+        </w:tc>
+      </w:tr>
+    </w:tbl>
+    <w:p>
+      <w:pPr>
+        <w:spacing w:after="20"/>
+      </w:pPr>
+    </w:p>
+    <w:p>
+      <w:pPr>
+        <w:keepLines/>
+      </w:pPr>
+      <w:r>
+        <w:t>The fee-free formula predicts 150,849.27 sUSD after the input, 172.15 sUSD below the published reserve because it omits the historical swap fee. The modeled spot-price multiplier is 2.6044. Under the hypothetical lender settings, the collateral reference value is 361.385 ETH and the 500 ETH cash cap yields g(540) = 138.129 ETH. Z3 returns SAT with an exactly replayed witness; the analytical rule agrees. This tests sensitivity to historical pool depth, not actual bZx profit. Inputs and outputs are saved in results/reviewer_extensions/historical_reserve_case.json.</w:t>
+      </w:r>
+    </w:p>
+    <w:p>
+      <w:pPr>
+        <w:pStyle w:val="Heading2"/>
+      </w:pPr>
+      <w:r>
+        <w:t>7.4 Structural scaling of the auxiliary pool model</w:t>
+      </w:r>
+    </w:p>
+    <w:p>
+      <w:pPr/>
+      <w:r>
+        <w:t>To vary model size rather than merely repeat a fixed query, we generated 1, 2, 4, 8, 16, and 32 distinct pools with one symbolic A-to-B swap per pool. Initial pool reserves are 1000 A and 1000 B; the wallet begins with 1000 A. Each query first checks feasibility, then asks for a violation of total token conservation. Three fresh queries were run per size on Windows with Python 3.12.14 and Z3 5.1.0; Table 6 reports median end-to-end check times, including both solver checks but excluding model construction. All cases were feasible and the conservation counterexample was UNSAT.</w:t>
+      </w:r>
+    </w:p>
+    <w:p>
+      <w:pPr>
+        <w:spacing w:after="100"/>
+        <w:jc w:val="center"/>
+      </w:pPr>
+      <w:r>
+        <w:rPr>
+          <w:i/>
+          <w:color w:val="46525D"/>
+          <w:sz w:val="17"/>
+        </w:rPr>
+        <w:t>Table 6. Auxiliary DAG structural scaling; three fresh runs per size.</w:t>
+      </w:r>
+    </w:p>
+    <w:tbl>
+      <w:tblPr>
+        <w:tblStyle w:val="TableGrid"/>
+        <w:tblW w:type="auto" w:w="0"/>
+        <w:jc w:val="center"/>
+        <w:tblLook w:firstColumn="1" w:firstRow="1" w:lastColumn="0" w:lastRow="0" w:noHBand="0" w:noVBand="1" w:val="04A0"/>
+      </w:tblPr>
+      <w:tblGrid>
+        <w:gridCol w:w="2469"/>
+        <w:gridCol w:w="2469"/>
+        <w:gridCol w:w="2469"/>
+        <w:gridCol w:w="2469"/>
+      </w:tblGrid>
+      <w:tr>
+        <w:tc>
+          <w:tcPr>
+            <w:tcW w:type="dxa" w:w="2376"/>
+            <w:shd w:fill="E7EFF3"/>
+          </w:tcPr>
+          <w:p>
+            <w:r>
+              <w:rPr>
+                <w:b/>
+                <w:color w:val="17324D"/>
+                <w:sz w:val="17"/>
+              </w:rPr>
+              <w:t>Pools / swaps</w:t>
+            </w:r>
+          </w:p>
+        </w:tc>
+        <w:tc>
+          <w:tcPr>
+            <w:tcW w:type="dxa" w:w="1800"/>
+            <w:shd w:fill="E7EFF3"/>
+          </w:tcPr>
+          <w:p>
+            <w:r>
+              <w:rPr>
+                <w:b/>
+                <w:color w:val="17324D"/>
+                <w:sz w:val="17"/>
+              </w:rPr>
+              <w:t>Assertions</w:t>
+            </w:r>
+          </w:p>
+        </w:tc>
+        <w:tc>
+          <w:tcPr>
+            <w:tcW w:type="dxa" w:w="2592"/>
+            <w:shd w:fill="E7EFF3"/>
+          </w:tcPr>
+          <w:p>
+            <w:r>
+              <w:rPr>
+                <w:b/>
+                <w:color w:val="17324D"/>
+                <w:sz w:val="17"/>
+              </w:rPr>
+              <w:t>Median encoding ms</w:t>
+            </w:r>
+          </w:p>
+        </w:tc>
+        <w:tc>
+          <w:tcPr>
+            <w:tcW w:type="dxa" w:w="2592"/>
+            <w:shd w:fill="E7EFF3"/>
+          </w:tcPr>
+          <w:p>
+            <w:r>
+              <w:rPr>
+                <w:b/>
+                <w:color w:val="17324D"/>
+                <w:sz w:val="17"/>
+              </w:rPr>
+              <w:t>Median checks ms</w:t>
+            </w:r>
+          </w:p>
+        </w:tc>
+      </w:tr>
+      <w:tr>
+        <w:tc>
+          <w:tcPr>
+            <w:tcW w:type="dxa" w:w="2376"/>
+            <w:vAlign w:val="center"/>
+          </w:tcPr>
+          <w:p>
+            <w:pPr>
+              <w:spacing w:after="40" w:before="40"/>
+            </w:pPr>
+            <w:r>
+              <w:rPr>
+                <w:rFonts w:ascii="Times New Roman" w:hAnsi="Times New Roman"/>
+                <w:sz w:val="16"/>
+              </w:rPr>
+              <w:t>1</w:t>
+            </w:r>
+          </w:p>
+        </w:tc>
+        <w:tc>
+          <w:tcPr>
+            <w:tcW w:type="dxa" w:w="1800"/>
+            <w:vAlign w:val="center"/>
+          </w:tcPr>
+          <w:p>
+            <w:pPr>
+              <w:spacing w:after="40" w:before="40"/>
+            </w:pPr>
+            <w:r>
+              <w:rPr>
+                <w:rFonts w:ascii="Times New Roman" w:hAnsi="Times New Roman"/>
+                <w:sz w:val="16"/>
+              </w:rPr>
+              <w:t>11</w:t>
+            </w:r>
+          </w:p>
+        </w:tc>
+        <w:tc>
+          <w:tcPr>
+            <w:tcW w:type="dxa" w:w="2592"/>
+            <w:vAlign w:val="center"/>
+          </w:tcPr>
+          <w:p>
+            <w:pPr>
+              <w:spacing w:after="40" w:before="40"/>
+            </w:pPr>
+            <w:r>
+              <w:rPr>
+                <w:rFonts w:ascii="Times New Roman" w:hAnsi="Times New Roman"/>
+                <w:sz w:val="16"/>
+              </w:rPr>
+              <w:t>1.628</w:t>
+            </w:r>
+          </w:p>
+        </w:tc>
+        <w:tc>
+          <w:tcPr>
+            <w:tcW w:type="dxa" w:w="2592"/>
+            <w:vAlign w:val="center"/>
+          </w:tcPr>
+          <w:p>
+            <w:pPr>
+              <w:spacing w:after="40" w:before="40"/>
+            </w:pPr>
+            <w:r>
+              <w:rPr>
+                <w:rFonts w:ascii="Times New Roman" w:hAnsi="Times New Roman"/>
+                <w:sz w:val="16"/>
+              </w:rPr>
+              <w:t>6.138</w:t>
+            </w:r>
+          </w:p>
+        </w:tc>
+      </w:tr>
+      <w:tr>
+        <w:tc>
+          <w:tcPr>
+            <w:tcW w:type="dxa" w:w="2376"/>
+            <w:vAlign w:val="center"/>
+            <w:shd w:fill="F7FAFB"/>
+          </w:tcPr>
+          <w:p>
+            <w:pPr>
+              <w:spacing w:after="40" w:before="40"/>
+            </w:pPr>
+            <w:r>
+              <w:rPr>
+                <w:rFonts w:ascii="Times New Roman" w:hAnsi="Times New Roman"/>
+                <w:sz w:val="16"/>
+              </w:rPr>
+              <w:t>2</w:t>
+            </w:r>
+          </w:p>
+        </w:tc>
+        <w:tc>
+          <w:tcPr>
+            <w:tcW w:type="dxa" w:w="1800"/>
+            <w:vAlign w:val="center"/>
+            <w:shd w:fill="F7FAFB"/>
+          </w:tcPr>
+          <w:p>
+            <w:pPr>
+              <w:spacing w:after="40" w:before="40"/>
+            </w:pPr>
+            <w:r>
+              <w:rPr>
+                <w:rFonts w:ascii="Times New Roman" w:hAnsi="Times New Roman"/>
+                <w:sz w:val="16"/>
+              </w:rPr>
+              <w:t>20</w:t>
+            </w:r>
+          </w:p>
+        </w:tc>
+        <w:tc>
+          <w:tcPr>
+            <w:tcW w:type="dxa" w:w="2592"/>
+            <w:vAlign w:val="center"/>
+            <w:shd w:fill="F7FAFB"/>
+          </w:tcPr>
+          <w:p>
+            <w:pPr>
+              <w:spacing w:after="40" w:before="40"/>
+            </w:pPr>
+            <w:r>
+              <w:rPr>
+                <w:rFonts w:ascii="Times New Roman" w:hAnsi="Times New Roman"/>
+                <w:sz w:val="16"/>
+              </w:rPr>
+              <w:t>2.481</w:t>
+            </w:r>
+          </w:p>
+        </w:tc>
+        <w:tc>
+          <w:tcPr>
+            <w:tcW w:type="dxa" w:w="2592"/>
+            <w:vAlign w:val="center"/>
+            <w:shd w:fill="F7FAFB"/>
+          </w:tcPr>
+          <w:p>
+            <w:pPr>
+              <w:spacing w:after="40" w:before="40"/>
+            </w:pPr>
+            <w:r>
+              <w:rPr>
+                <w:rFonts w:ascii="Times New Roman" w:hAnsi="Times New Roman"/>
+                <w:sz w:val="16"/>
+              </w:rPr>
+              <w:t>5.923</w:t>
+            </w:r>
+          </w:p>
+        </w:tc>
+      </w:tr>
+      <w:tr>
+        <w:tc>
+          <w:tcPr>
+            <w:tcW w:type="dxa" w:w="2376"/>
+            <w:vAlign w:val="center"/>
+          </w:tcPr>
+          <w:p>
+            <w:pPr>
+              <w:spacing w:after="40" w:before="40"/>
+            </w:pPr>
+            <w:r>
+              <w:rPr>
+                <w:rFonts w:ascii="Times New Roman" w:hAnsi="Times New Roman"/>
+                <w:sz w:val="16"/>
+              </w:rPr>
+              <w:t>4</w:t>
+            </w:r>
+          </w:p>
+        </w:tc>
+        <w:tc>
+          <w:tcPr>
+            <w:tcW w:type="dxa" w:w="1800"/>
+            <w:vAlign w:val="center"/>
+          </w:tcPr>
+          <w:p>
+            <w:pPr>
+              <w:spacing w:after="40" w:before="40"/>
+            </w:pPr>
+            <w:r>
+              <w:rPr>
+                <w:rFonts w:ascii="Times New Roman" w:hAnsi="Times New Roman"/>
+                <w:sz w:val="16"/>
+              </w:rPr>
+              <w:t>38</w:t>
+            </w:r>
+          </w:p>
+        </w:tc>
+        <w:tc>
+          <w:tcPr>
+            <w:tcW w:type="dxa" w:w="2592"/>
+            <w:vAlign w:val="center"/>
+          </w:tcPr>
+          <w:p>
+            <w:pPr>
+              <w:spacing w:after="40" w:before="40"/>
+            </w:pPr>
+            <w:r>
+              <w:rPr>
+                <w:rFonts w:ascii="Times New Roman" w:hAnsi="Times New Roman"/>
+                <w:sz w:val="16"/>
+              </w:rPr>
+              <w:t>4.416</w:t>
+            </w:r>
+          </w:p>
+        </w:tc>
+        <w:tc>
+          <w:tcPr>
+            <w:tcW w:type="dxa" w:w="2592"/>
+            <w:vAlign w:val="center"/>
+          </w:tcPr>
+          <w:p>
+            <w:pPr>
+              <w:spacing w:after="40" w:before="40"/>
+            </w:pPr>
+            <w:r>
+              <w:rPr>
+                <w:rFonts w:ascii="Times New Roman" w:hAnsi="Times New Roman"/>
+                <w:sz w:val="16"/>
+              </w:rPr>
+              <w:t>5.142</w:t>
+            </w:r>
+          </w:p>
+        </w:tc>
+      </w:tr>
+      <w:tr>
+        <w:tc>
+          <w:tcPr>
+            <w:tcW w:type="dxa" w:w="2376"/>
+            <w:vAlign w:val="center"/>
+            <w:shd w:fill="F7FAFB"/>
+          </w:tcPr>
+          <w:p>
+            <w:pPr>
+              <w:spacing w:after="40" w:before="40"/>
+            </w:pPr>
+            <w:r>
+              <w:rPr>
+                <w:rFonts w:ascii="Times New Roman" w:hAnsi="Times New Roman"/>
+                <w:sz w:val="16"/>
+              </w:rPr>
+              <w:t>8</w:t>
+            </w:r>
+          </w:p>
+        </w:tc>
+        <w:tc>
+          <w:tcPr>
+            <w:tcW w:type="dxa" w:w="1800"/>
+            <w:vAlign w:val="center"/>
+            <w:shd w:fill="F7FAFB"/>
+          </w:tcPr>
+          <w:p>
+            <w:pPr>
+              <w:spacing w:after="40" w:before="40"/>
+            </w:pPr>
+            <w:r>
+              <w:rPr>
+                <w:rFonts w:ascii="Times New Roman" w:hAnsi="Times New Roman"/>
+                <w:sz w:val="16"/>
+              </w:rPr>
+              <w:t>74</w:t>
+            </w:r>
+          </w:p>
+        </w:tc>
+        <w:tc>
+          <w:tcPr>
+            <w:tcW w:type="dxa" w:w="2592"/>
+            <w:vAlign w:val="center"/>
+            <w:shd w:fill="F7FAFB"/>
+          </w:tcPr>
+          <w:p>
+            <w:pPr>
+              <w:spacing w:after="40" w:before="40"/>
+            </w:pPr>
+            <w:r>
+              <w:rPr>
+                <w:rFonts w:ascii="Times New Roman" w:hAnsi="Times New Roman"/>
+                <w:sz w:val="16"/>
+              </w:rPr>
+              <w:t>5.872</w:t>
+            </w:r>
+          </w:p>
+        </w:tc>
+        <w:tc>
+          <w:tcPr>
+            <w:tcW w:type="dxa" w:w="2592"/>
+            <w:vAlign w:val="center"/>
+            <w:shd w:fill="F7FAFB"/>
+          </w:tcPr>
+          <w:p>
+            <w:pPr>
+              <w:spacing w:after="40" w:before="40"/>
+            </w:pPr>
+            <w:r>
+              <w:rPr>
+                <w:rFonts w:ascii="Times New Roman" w:hAnsi="Times New Roman"/>
+                <w:sz w:val="16"/>
+              </w:rPr>
+              <w:t>7.415</w:t>
+            </w:r>
+          </w:p>
+        </w:tc>
+      </w:tr>
+      <w:tr>
+        <w:tc>
+          <w:tcPr>
+            <w:tcW w:type="dxa" w:w="2376"/>
+            <w:vAlign w:val="center"/>
+          </w:tcPr>
+          <w:p>
+            <w:pPr>
+              <w:spacing w:after="40" w:before="40"/>
+            </w:pPr>
+            <w:r>
+              <w:rPr>
+                <w:rFonts w:ascii="Times New Roman" w:hAnsi="Times New Roman"/>
+                <w:sz w:val="16"/>
+              </w:rPr>
+              <w:t>16</w:t>
+            </w:r>
+          </w:p>
+        </w:tc>
+        <w:tc>
+          <w:tcPr>
+            <w:tcW w:type="dxa" w:w="1800"/>
+            <w:vAlign w:val="center"/>
+          </w:tcPr>
+          <w:p>
+            <w:pPr>
+              <w:spacing w:after="40" w:before="40"/>
+            </w:pPr>
+            <w:r>
+              <w:rPr>
+                <w:rFonts w:ascii="Times New Roman" w:hAnsi="Times New Roman"/>
+                <w:sz w:val="16"/>
+              </w:rPr>
+              <w:t>146</w:t>
+            </w:r>
+          </w:p>
+        </w:tc>
+        <w:tc>
+          <w:tcPr>
+            <w:tcW w:type="dxa" w:w="2592"/>
+            <w:vAlign w:val="center"/>
+          </w:tcPr>
+          <w:p>
+            <w:pPr>
+              <w:spacing w:after="40" w:before="40"/>
+            </w:pPr>
+            <w:r>
+              <w:rPr>
+                <w:rFonts w:ascii="Times New Roman" w:hAnsi="Times New Roman"/>
+                <w:sz w:val="16"/>
+              </w:rPr>
+              <w:t>15.612</w:t>
+            </w:r>
+          </w:p>
+        </w:tc>
+        <w:tc>
+          <w:tcPr>
+            <w:tcW w:type="dxa" w:w="2592"/>
+            <w:vAlign w:val="center"/>
+          </w:tcPr>
+          <w:p>
+            <w:pPr>
+              <w:spacing w:after="40" w:before="40"/>
+            </w:pPr>
+            <w:r>
+              <w:rPr>
+                <w:rFonts w:ascii="Times New Roman" w:hAnsi="Times New Roman"/>
+                <w:sz w:val="16"/>
+              </w:rPr>
+              <w:t>10.009</w:t>
+            </w:r>
+          </w:p>
+        </w:tc>
+      </w:tr>
+      <w:tr>
+        <w:tc>
+          <w:tcPr>
+            <w:tcW w:type="dxa" w:w="2376"/>
+            <w:vAlign w:val="center"/>
+            <w:shd w:fill="F7FAFB"/>
+          </w:tcPr>
+          <w:p>
+            <w:pPr>
+              <w:spacing w:after="40" w:before="40"/>
+            </w:pPr>
+            <w:r>
+              <w:rPr>
+                <w:rFonts w:ascii="Times New Roman" w:hAnsi="Times New Roman"/>
+                <w:sz w:val="16"/>
+              </w:rPr>
+              <w:t>32</w:t>
+            </w:r>
+          </w:p>
+        </w:tc>
+        <w:tc>
+          <w:tcPr>
+            <w:tcW w:type="dxa" w:w="1800"/>
+            <w:vAlign w:val="center"/>
+            <w:shd w:fill="F7FAFB"/>
+          </w:tcPr>
+          <w:p>
+            <w:pPr>
+              <w:spacing w:after="40" w:before="40"/>
+            </w:pPr>
+            <w:r>
+              <w:rPr>
+                <w:rFonts w:ascii="Times New Roman" w:hAnsi="Times New Roman"/>
+                <w:sz w:val="16"/>
+              </w:rPr>
+              <w:t>290</w:t>
+            </w:r>
+          </w:p>
+        </w:tc>
+        <w:tc>
+          <w:tcPr>
+            <w:tcW w:type="dxa" w:w="2592"/>
+            <w:vAlign w:val="center"/>
+            <w:shd w:fill="F7FAFB"/>
+          </w:tcPr>
+          <w:p>
+            <w:pPr>
+              <w:spacing w:after="40" w:before="40"/>
+            </w:pPr>
+            <w:r>
+              <w:rPr>
+                <w:rFonts w:ascii="Times New Roman" w:hAnsi="Times New Roman"/>
+                <w:sz w:val="16"/>
+              </w:rPr>
+              <w:t>28.956</w:t>
+            </w:r>
+          </w:p>
+        </w:tc>
+        <w:tc>
+          <w:tcPr>
+            <w:tcW w:type="dxa" w:w="2592"/>
+            <w:vAlign w:val="center"/>
+            <w:shd w:fill="F7FAFB"/>
+          </w:tcPr>
+          <w:p>
+            <w:pPr>
+              <w:spacing w:after="40" w:before="40"/>
+            </w:pPr>
+            <w:r>
+              <w:rPr>
+                <w:rFonts w:ascii="Times New Roman" w:hAnsi="Times New Roman"/>
+                <w:sz w:val="16"/>
+              </w:rPr>
+              <w:t>14.377</w:t>
+            </w:r>
+          </w:p>
+        </w:tc>
+      </w:tr>
+    </w:tbl>
+    <w:p>
+      <w:pPr>
+        <w:spacing w:after="20"/>
+      </w:pPr>
+    </w:p>
+    <w:p>
+      <w:pPr/>
+      <w:r>
+        <w:t>These small, independent swaps exercise only the auxiliary conservation encoding. They do not enlarge the core lender attack schedule, synthesize paths, or establish asymptotic scalability for realistic DeFi compositions. Raw per-run measurements and the generator are in results/reviewer_extensions/structural_scaling.json and src/utils/reviewer_extensions.py.</w:t>
+      </w:r>
+    </w:p>
+    <w:p>
+      <w:pPr>
         <w:pStyle w:val="Heading1"/>
       </w:pPr>
       <w:r>
@@ -2430,7 +3465,7 @@
     <w:p>
       <w:pPr/>
       <w:r>
-        <w:t>These answers do not establish exploit likelihood. The synthetic grid was chosen to exercise the model, not to sample deployed protocols. Reserve scales alone do not constitute a scalability study. The historical reports motivate the proxy cases, but no archive-state reserves or deployed contract parameters were calibrated to them. A true historical comparison would require the exact block state, oracle implementation, reserves, fees, liquidation behavior, and contract traces.</w:t>
+        <w:t>These answers do not establish exploit likelihood. The synthetic grid was chosen to exercise the model, not to sample deployed protocols. The reserve-calibrated counterfactual tests the model at one published historical pool depth, while Section 7.4 bounds what the auxiliary scaling experiment measures. A true historical transaction replay would require exact block state, oracle implementation, reserves, fees, liquidation behavior, and contract traces.</w:t>
       </w:r>
     </w:p>
     <w:p>
@@ -2450,7 +3485,7 @@
     <w:p>
       <w:pPr/>
       <w:r>
-        <w:t>The reviewer requested a historical reserve calibration and an executable comparison against another DeFi tool. Neither has been completed in this revision. The paper therefore restricts its empirical claim to the synthetic grid and presents prior-system comparison as a scope analysis. A repository alone does not provide a DOI; a DOI requires a separately archived release.</w:t>
+        <w:t>The historical calibration uses rounded reserve figures from a published analysis rather than an archive-node extraction, and the remaining lender parameters are counterfactual. A matched executable comparison against another DeFi tool remains open: the available FlashSyn artifact requires a Linux/Docker environment and implements different action and settlement semantics [14]. The auxiliary scaling experiment is not an attack-synthesis benchmark. A repository URL is not an archival DOI; a DOI requires a separately deposited release.</w:t>
       </w:r>
     </w:p>
     <w:p>
@@ -2464,7 +3499,7 @@
     <w:p>
       <w:pPr/>
       <w:r>
-        <w:t>Explicit accounting makes an oracle-driven lending failure checkable even when the AMM itself finishes at its starting reserves. In the fixed capped model, the maximum extraction is determined by a small finite set of candidate flash amounts. Conditional oracle, dynamic LTV, and depth bounds can exclude positive extraction. The implementation corroborates those analytical classifications across 90 synthetic settings. Extending these results to deployed systems requires historical-state calibration and contract-level refinement.</w:t>
+        <w:t>Explicit accounting makes an oracle-driven lending failure checkable even when the AMM itself finishes at its starting reserves. In the fixed capped model, the maximum extraction is determined by a small finite set of candidate flash amounts. Conditional oracle, dynamic LTV, and depth bounds can exclude positive extraction. The implementation corroborates those classifications across 90 synthetic settings and a reserve-calibrated counterfactual. Extending the result to deployed systems requires a historical transaction replay, contract-level refinement, and matched comparison with existing tools.</w:t>
       </w:r>
     </w:p>
     <w:p>
@@ -2490,7 +3525,13 @@
     <w:p>
       <w:pPr/>
       <w:r>
-        <w:t>Funding and conflicts of interest: The author should complete these declarations for the target venue before submission; no statement about funding or conflicts is inferred from the supplied materials.</w:t>
+        <w:t>Funding: The author reports receiving no funding or financial support for this work.</w:t>
+      </w:r>
+    </w:p>
+    <w:p>
+      <w:pPr/>
+      <w:r>
+        <w:t>Conflicts of interest: The author declares no conflicts of interest.</w:t>
       </w:r>
     </w:p>
     <w:p>
@@ -2657,6 +3698,18 @@
         <w:t>[13] Euler Finance, “War &amp; Peace: Behind the Scenes of Euler’s $240M Exploit Recovery.” https://www.euler.finance/blog/war-peace-behind-the-scenes-of-eulers-240m-exploit-recovery</w:t>
       </w:r>
     </w:p>
+    <w:p>
+      <w:pPr>
+        <w:spacing w:after="40" w:line="240" w:lineRule="auto"/>
+        <w:ind w:left="360" w:hanging="360"/>
+      </w:pPr>
+      <w:r>
+        <w:rPr>
+          <w:sz w:val="18"/>
+        </w:rPr>
+        <w:t>[14] Z. Chen, S. M. Beillahi, and F. Long, “FlashSyn Artifact,” ICSE 2024. https://github.com/FlashSyn-Artifact/FlashSyn-Artifact-ICSE24</w:t>
+      </w:r>
+    </w:p>
     <w:sectPr>
       <w:footerReference w:type="default" r:id="rId14"/>
       <w:pgSz w:w="12240" w:h="15840"/>
@@ -3396,9 +4449,6 @@
     <w:qFormat/>
     <w:rsid w:val="00FC693F"/>
     <w:pPr>
-      <w:pBdr>
-        <w:bottom w:val="single" w:sz="8" w:space="4" w:color="4F81BD" w:themeColor="accent1"/>
-      </w:pBdr>
       <w:spacing w:after="300" w:line="240" w:lineRule="auto"/>
       <w:contextualSpacing/>
     </w:pPr>

</xml_diff>

<commit_message>
Document implementation with code excerpts and repository map
</commit_message>
<xml_diff>
--- a/paper/Shorya_Jaiswal_Revised_Research_Paper.docx
+++ b/paper/Shorya_Jaiswal_Revised_Research_Paper.docx
@@ -762,13 +762,550 @@
     </w:p>
     <w:p>
       <w:pPr>
+        <w:pStyle w:val="Heading2"/>
+      </w:pPr>
+      <w:r>
+        <w:t>5.1 Code artifact and implementation</w:t>
+      </w:r>
+    </w:p>
+    <w:p>
+      <w:pPr/>
+      <w:r>
+        <w:t>The repository https://github.com/shoryaj/crypto-paper contains the full source, tests, and saved outputs. Table 2 maps the mathematical steps to files a reader can inspect. The core is Python code, not a deployed smart contract. The repository is private at the time of this manuscript; readers require access from the author.</w:t>
+      </w:r>
+    </w:p>
+    <w:p>
+      <w:pPr>
+        <w:spacing w:after="100"/>
+        <w:jc w:val="center"/>
+      </w:pPr>
+      <w:r>
+        <w:rPr>
+          <w:i/>
+          <w:color w:val="46525D"/>
+          <w:sz w:val="17"/>
+        </w:rPr>
+        <w:t>Table 2. Where the executable parts of the paper are implemented.</w:t>
+      </w:r>
+    </w:p>
+    <w:tbl>
+      <w:tblPr>
+        <w:tblStyle w:val="TableGrid"/>
+        <w:tblW w:type="auto" w:w="0"/>
+        <w:jc w:val="center"/>
+        <w:tblLook w:firstColumn="1" w:firstRow="1" w:lastColumn="0" w:lastRow="0" w:noHBand="0" w:noVBand="1" w:val="04A0"/>
+      </w:tblPr>
+      <w:tblGrid>
+        <w:gridCol w:w="3293"/>
+        <w:gridCol w:w="3293"/>
+        <w:gridCol w:w="3293"/>
+      </w:tblGrid>
+      <w:tr>
+        <w:tc>
+          <w:tcPr>
+            <w:tcW w:type="dxa" w:w="3168"/>
+            <w:shd w:fill="E7EFF3"/>
+          </w:tcPr>
+          <w:p>
+            <w:r>
+              <w:rPr>
+                <w:b/>
+                <w:color w:val="17324D"/>
+                <w:sz w:val="17"/>
+              </w:rPr>
+              <w:t>Repository path</w:t>
+            </w:r>
+          </w:p>
+        </w:tc>
+        <w:tc>
+          <w:tcPr>
+            <w:tcW w:type="dxa" w:w="3672"/>
+            <w:shd w:fill="E7EFF3"/>
+          </w:tcPr>
+          <w:p>
+            <w:r>
+              <w:rPr>
+                <w:b/>
+                <w:color w:val="17324D"/>
+                <w:sz w:val="17"/>
+              </w:rPr>
+              <w:t>Purpose</w:t>
+            </w:r>
+          </w:p>
+        </w:tc>
+        <w:tc>
+          <w:tcPr>
+            <w:tcW w:type="dxa" w:w="2952"/>
+            <w:shd w:fill="E7EFF3"/>
+          </w:tcPr>
+          <w:p>
+            <w:r>
+              <w:rPr>
+                <w:b/>
+                <w:color w:val="17324D"/>
+                <w:sz w:val="17"/>
+              </w:rPr>
+              <w:t>Paper connection</w:t>
+            </w:r>
+          </w:p>
+        </w:tc>
+      </w:tr>
+      <w:tr>
+        <w:tc>
+          <w:tcPr>
+            <w:tcW w:type="dxa" w:w="3168"/>
+            <w:vAlign w:val="center"/>
+          </w:tcPr>
+          <w:p>
+            <w:pPr>
+              <w:spacing w:after="40" w:before="40"/>
+            </w:pPr>
+            <w:r>
+              <w:rPr>
+                <w:rFonts w:ascii="Times New Roman" w:hAnsi="Times New Roman"/>
+                <w:sz w:val="16"/>
+              </w:rPr>
+              <w:t>src/core/amm_model.py</w:t>
+            </w:r>
+          </w:p>
+        </w:tc>
+        <w:tc>
+          <w:tcPr>
+            <w:tcW w:type="dxa" w:w="3672"/>
+            <w:vAlign w:val="center"/>
+          </w:tcPr>
+          <w:p>
+            <w:pPr>
+              <w:spacing w:after="40" w:before="40"/>
+            </w:pPr>
+            <w:r>
+              <w:rPr>
+                <w:rFonts w:ascii="Times New Roman" w:hAnsi="Times New Roman"/>
+                <w:sz w:val="16"/>
+              </w:rPr>
+              <w:t>Encodes a fee-free constant-product swap</w:t>
+            </w:r>
+          </w:p>
+        </w:tc>
+        <w:tc>
+          <w:tcPr>
+            <w:tcW w:type="dxa" w:w="2952"/>
+            <w:vAlign w:val="center"/>
+          </w:tcPr>
+          <w:p>
+            <w:pPr>
+              <w:spacing w:after="40" w:before="40"/>
+            </w:pPr>
+            <w:r>
+              <w:rPr>
+                <w:rFonts w:ascii="Times New Roman" w:hAnsi="Times New Roman"/>
+                <w:sz w:val="16"/>
+              </w:rPr>
+              <w:t>Reserve update in Eq. (1)</w:t>
+            </w:r>
+          </w:p>
+        </w:tc>
+      </w:tr>
+      <w:tr>
+        <w:tc>
+          <w:tcPr>
+            <w:tcW w:type="dxa" w:w="3168"/>
+            <w:vAlign w:val="center"/>
+            <w:shd w:fill="F7FAFB"/>
+          </w:tcPr>
+          <w:p>
+            <w:pPr>
+              <w:spacing w:after="40" w:before="40"/>
+            </w:pPr>
+            <w:r>
+              <w:rPr>
+                <w:rFonts w:ascii="Times New Roman" w:hAnsi="Times New Roman"/>
+                <w:sz w:val="16"/>
+              </w:rPr>
+              <w:t>src/core/verifier.py</w:t>
+            </w:r>
+          </w:p>
+        </w:tc>
+        <w:tc>
+          <w:tcPr>
+            <w:tcW w:type="dxa" w:w="3672"/>
+            <w:vAlign w:val="center"/>
+            <w:shd w:fill="F7FAFB"/>
+          </w:tcPr>
+          <w:p>
+            <w:pPr>
+              <w:spacing w:after="40" w:before="40"/>
+            </w:pPr>
+            <w:r>
+              <w:rPr>
+                <w:rFonts w:ascii="Times New Roman" w:hAnsi="Times New Roman"/>
+                <w:sz w:val="16"/>
+              </w:rPr>
+              <w:t>Builds swap, oracle, lending, profit, and Z3 constraints; replays SAT witnesses exactly</w:t>
+            </w:r>
+          </w:p>
+        </w:tc>
+        <w:tc>
+          <w:tcPr>
+            <w:tcW w:type="dxa" w:w="2952"/>
+            <w:vAlign w:val="center"/>
+            <w:shd w:fill="F7FAFB"/>
+          </w:tcPr>
+          <w:p>
+            <w:pPr>
+              <w:spacing w:after="40" w:before="40"/>
+            </w:pPr>
+            <w:r>
+              <w:rPr>
+                <w:rFonts w:ascii="Times New Roman" w:hAnsi="Times New Roman"/>
+                <w:sz w:val="16"/>
+              </w:rPr>
+              <w:t>Eqs. (2)–(3) and invariant query</w:t>
+            </w:r>
+          </w:p>
+        </w:tc>
+      </w:tr>
+      <w:tr>
+        <w:tc>
+          <w:tcPr>
+            <w:tcW w:type="dxa" w:w="3168"/>
+            <w:vAlign w:val="center"/>
+          </w:tcPr>
+          <w:p>
+            <w:pPr>
+              <w:spacing w:after="40" w:before="40"/>
+            </w:pPr>
+            <w:r>
+              <w:rPr>
+                <w:rFonts w:ascii="Times New Roman" w:hAnsi="Times New Roman"/>
+                <w:sz w:val="16"/>
+              </w:rPr>
+              <w:t>src/core/analysis.py</w:t>
+            </w:r>
+          </w:p>
+        </w:tc>
+        <w:tc>
+          <w:tcPr>
+            <w:tcW w:type="dxa" w:w="3672"/>
+            <w:vAlign w:val="center"/>
+          </w:tcPr>
+          <w:p>
+            <w:pPr>
+              <w:spacing w:after="40" w:before="40"/>
+            </w:pPr>
+            <w:r>
+              <w:rPr>
+                <w:rFonts w:ascii="Times New Roman" w:hAnsi="Times New Roman"/>
+                <w:sz w:val="16"/>
+              </w:rPr>
+              <w:t>Computes finite candidate values and liquidity bound</w:t>
+            </w:r>
+          </w:p>
+        </w:tc>
+        <w:tc>
+          <w:tcPr>
+            <w:tcW w:type="dxa" w:w="2952"/>
+            <w:vAlign w:val="center"/>
+          </w:tcPr>
+          <w:p>
+            <w:pPr>
+              <w:spacing w:after="40" w:before="40"/>
+            </w:pPr>
+            <w:r>
+              <w:rPr>
+                <w:rFonts w:ascii="Times New Roman" w:hAnsi="Times New Roman"/>
+                <w:sz w:val="16"/>
+              </w:rPr>
+              <w:t>Theorem 1 and Eq. (6)</w:t>
+            </w:r>
+          </w:p>
+        </w:tc>
+      </w:tr>
+      <w:tr>
+        <w:tc>
+          <w:tcPr>
+            <w:tcW w:type="dxa" w:w="3168"/>
+            <w:vAlign w:val="center"/>
+            <w:shd w:fill="F7FAFB"/>
+          </w:tcPr>
+          <w:p>
+            <w:pPr>
+              <w:spacing w:after="40" w:before="40"/>
+            </w:pPr>
+            <w:r>
+              <w:rPr>
+                <w:rFonts w:ascii="Times New Roman" w:hAnsi="Times New Roman"/>
+                <w:sz w:val="16"/>
+              </w:rPr>
+              <w:t>src/utils/benchmark.py</w:t>
+            </w:r>
+          </w:p>
+        </w:tc>
+        <w:tc>
+          <w:tcPr>
+            <w:tcW w:type="dxa" w:w="3672"/>
+            <w:vAlign w:val="center"/>
+            <w:shd w:fill="F7FAFB"/>
+          </w:tcPr>
+          <w:p>
+            <w:pPr>
+              <w:spacing w:after="40" w:before="40"/>
+            </w:pPr>
+            <w:r>
+              <w:rPr>
+                <w:rFonts w:ascii="Times New Roman" w:hAnsi="Times New Roman"/>
+                <w:sz w:val="16"/>
+              </w:rPr>
+              <w:t>Runs the 90-setting synthetic grid and exports SMT-LIB queries</w:t>
+            </w:r>
+          </w:p>
+        </w:tc>
+        <w:tc>
+          <w:tcPr>
+            <w:tcW w:type="dxa" w:w="2952"/>
+            <w:vAlign w:val="center"/>
+            <w:shd w:fill="F7FAFB"/>
+          </w:tcPr>
+          <w:p>
+            <w:pPr>
+              <w:spacing w:after="40" w:before="40"/>
+            </w:pPr>
+            <w:r>
+              <w:rPr>
+                <w:rFonts w:ascii="Times New Roman" w:hAnsi="Times New Roman"/>
+                <w:sz w:val="16"/>
+              </w:rPr>
+              <w:t>Section 7.1</w:t>
+            </w:r>
+          </w:p>
+        </w:tc>
+      </w:tr>
+      <w:tr>
+        <w:tc>
+          <w:tcPr>
+            <w:tcW w:type="dxa" w:w="3168"/>
+            <w:vAlign w:val="center"/>
+          </w:tcPr>
+          <w:p>
+            <w:pPr>
+              <w:spacing w:after="40" w:before="40"/>
+            </w:pPr>
+            <w:r>
+              <w:rPr>
+                <w:rFonts w:ascii="Times New Roman" w:hAnsi="Times New Roman"/>
+                <w:sz w:val="16"/>
+              </w:rPr>
+              <w:t>src/utils/reviewer_extensions.py</w:t>
+            </w:r>
+          </w:p>
+        </w:tc>
+        <w:tc>
+          <w:tcPr>
+            <w:tcW w:type="dxa" w:w="3672"/>
+            <w:vAlign w:val="center"/>
+          </w:tcPr>
+          <w:p>
+            <w:pPr>
+              <w:spacing w:after="40" w:before="40"/>
+            </w:pPr>
+            <w:r>
+              <w:rPr>
+                <w:rFonts w:ascii="Times New Roman" w:hAnsi="Times New Roman"/>
+                <w:sz w:val="16"/>
+              </w:rPr>
+              <w:t>Runs published-reserve counterfactual and pool scaling experiment</w:t>
+            </w:r>
+          </w:p>
+        </w:tc>
+        <w:tc>
+          <w:tcPr>
+            <w:tcW w:type="dxa" w:w="2952"/>
+            <w:vAlign w:val="center"/>
+          </w:tcPr>
+          <w:p>
+            <w:pPr>
+              <w:spacing w:after="40" w:before="40"/>
+            </w:pPr>
+            <w:r>
+              <w:rPr>
+                <w:rFonts w:ascii="Times New Roman" w:hAnsi="Times New Roman"/>
+                <w:sz w:val="16"/>
+              </w:rPr>
+              <w:t>Sections 7.3–7.4</w:t>
+            </w:r>
+          </w:p>
+        </w:tc>
+      </w:tr>
+      <w:tr>
+        <w:tc>
+          <w:tcPr>
+            <w:tcW w:type="dxa" w:w="3168"/>
+            <w:vAlign w:val="center"/>
+            <w:shd w:fill="F7FAFB"/>
+          </w:tcPr>
+          <w:p>
+            <w:pPr>
+              <w:spacing w:after="40" w:before="40"/>
+            </w:pPr>
+            <w:r>
+              <w:rPr>
+                <w:rFonts w:ascii="Times New Roman" w:hAnsi="Times New Roman"/>
+                <w:sz w:val="16"/>
+              </w:rPr>
+              <w:t>tests/test_verification.py</w:t>
+            </w:r>
+          </w:p>
+        </w:tc>
+        <w:tc>
+          <w:tcPr>
+            <w:tcW w:type="dxa" w:w="3672"/>
+            <w:vAlign w:val="center"/>
+            <w:shd w:fill="F7FAFB"/>
+          </w:tcPr>
+          <w:p>
+            <w:pPr>
+              <w:spacing w:after="40" w:before="40"/>
+            </w:pPr>
+            <w:r>
+              <w:rPr>
+                <w:rFonts w:ascii="Times New Roman" w:hAnsi="Times New Roman"/>
+                <w:sz w:val="16"/>
+              </w:rPr>
+              <w:t>Exercises economic decisions, controls, and model accounting</w:t>
+            </w:r>
+          </w:p>
+        </w:tc>
+        <w:tc>
+          <w:tcPr>
+            <w:tcW w:type="dxa" w:w="2952"/>
+            <w:vAlign w:val="center"/>
+            <w:shd w:fill="F7FAFB"/>
+          </w:tcPr>
+          <w:p>
+            <w:pPr>
+              <w:spacing w:after="40" w:before="40"/>
+            </w:pPr>
+            <w:r>
+              <w:rPr>
+                <w:rFonts w:ascii="Times New Roman" w:hAnsi="Times New Roman"/>
+                <w:sz w:val="16"/>
+              </w:rPr>
+              <w:t>Regression checks</w:t>
+            </w:r>
+          </w:p>
+        </w:tc>
+      </w:tr>
+    </w:tbl>
+    <w:p>
+      <w:pPr>
+        <w:spacing w:after="20"/>
+      </w:pPr>
+    </w:p>
+    <w:p>
+      <w:pPr/>
+      <w:r>
+        <w:t>The AMM primitive implements the constant-product invariant as a polynomial equality. This avoids division by an unconstrained symbolic expression; positive reserve guards preserve the intended domain. The following lines are from src/core/amm_model.py:</w:t>
+      </w:r>
+    </w:p>
+    <w:p>
+      <w:pPr>
+        <w:keepLines/>
+        <w:spacing w:before="80" w:after="140"/>
+        <w:ind w:left="403" w:right="259"/>
+        <w:shd w:fill="F2F5F7"/>
+      </w:pPr>
+      <w:r>
+        <w:rPr>
+          <w:rFonts w:ascii="Consolas" w:hAnsi="Consolas"/>
+          <w:sz w:val="16"/>
+        </w:rPr>
+        <w:t>solver.add(reserve_in &gt; 0, reserve_out &gt; 0, amount &gt;= 0,</w:t>
+        <w:br/>
+      </w:r>
+      <w:r>
+        <w:rPr>
+          <w:rFonts w:ascii="Consolas" w:hAnsi="Consolas"/>
+          <w:sz w:val="16"/>
+        </w:rPr>
+        <w:t xml:space="preserve">           output &gt;= 0, output &lt; reserve_out,</w:t>
+        <w:br/>
+      </w:r>
+      <w:r>
+        <w:rPr>
+          <w:rFonts w:ascii="Consolas" w:hAnsi="Consolas"/>
+          <w:sz w:val="16"/>
+        </w:rPr>
+        <w:t xml:space="preserve">           (reserve_in + amount) * (reserve_out - output)</w:t>
+        <w:br/>
+      </w:r>
+      <w:r>
+        <w:rPr>
+          <w:rFonts w:ascii="Consolas" w:hAnsi="Consolas"/>
+          <w:sz w:val="16"/>
+        </w:rPr>
+        <w:t xml:space="preserve">           == reserve_in * reserve_out)</w:t>
+      </w:r>
+    </w:p>
+    <w:p>
+      <w:pPr/>
+      <w:r>
+        <w:t>In src/core/verifier.py, the lending constraint produces borrow; then the program accounts for the AMM reversal, flash-loan repayment, and original collateral value. A positive profit is the counterexample sought by Z3:</w:t>
+      </w:r>
+    </w:p>
+    <w:p>
+      <w:pPr>
+        <w:keepLines/>
+        <w:spacing w:before="80" w:after="140"/>
+        <w:ind w:left="403" w:right="259"/>
+        <w:shd w:fill="F2F5F7"/>
+      </w:pPr>
+      <w:r>
+        <w:rPr>
+          <w:rFonts w:ascii="Consolas" w:hAnsi="Consolas"/>
+          <w:sz w:val="16"/>
+        </w:rPr>
+        <w:t>self.borrow = borrowing(self.solver, self.c, oracle, ltv, self.T)</w:t>
+        <w:br/>
+      </w:r>
+      <w:r>
+        <w:rPr>
+          <w:rFonts w:ascii="Consolas" w:hAnsi="Consolas"/>
+          <w:sz w:val="16"/>
+        </w:rPr>
+        <w:t>self.wallet_final = self.borrow + self.b_return - self.f * (1 + self.r)</w:t>
+        <w:br/>
+      </w:r>
+      <w:r>
+        <w:rPr>
+          <w:rFonts w:ascii="Consolas" w:hAnsi="Consolas"/>
+          <w:sz w:val="16"/>
+        </w:rPr>
+        <w:t>self.profit = self.wallet_final - self.c * self.p0</w:t>
+        <w:br/>
+      </w:r>
+      <w:r>
+        <w:rPr>
+          <w:rFonts w:ascii="Consolas" w:hAnsi="Consolas"/>
+          <w:sz w:val="16"/>
+        </w:rPr>
+        <w:t>self.solver.add(self.wallet_final &gt;= 0)</w:t>
+      </w:r>
+    </w:p>
+    <w:p>
+      <w:pPr/>
+      <w:r>
+        <w:t>The independent analytical path in src/core/analysis.py evaluates f = 0, f = F, and any admissible cash-cap kink. It compares their exact symbolic values with the Z3 decision. The benchmark stores each solver query under results/queries and records outcomes in results/sweep.csv and results/sweep.json. The tests run with python -m pytest -q; the recorded run passed 31 tests. Readers can rerun the benchmark with python -m src.utils.benchmark and the added case studies with python -m src.utils.reviewer_extensions. These short excerpts show the coding logic without using screenshots as scientific evidence; the complete functions remain in the repository.</w:t>
+      </w:r>
+    </w:p>
+    <w:p>
+      <w:pPr>
         <w:keepNext/>
         <w:jc w:val="center"/>
       </w:pPr>
       <w:r>
         <w:drawing>
           <wp:inline xmlns:a="http://schemas.openxmlformats.org/drawingml/2006/main" xmlns:pic="http://schemas.openxmlformats.org/drawingml/2006/picture">
-            <wp:extent cx="6217920" cy="3495853"/>
+            <wp:extent cx="5669280" cy="3187395"/>
             <wp:docPr id="2" name="Picture 2"/>
             <wp:cNvGraphicFramePr>
               <a:graphicFrameLocks noChangeAspect="1"/>
@@ -789,7 +1326,7 @@
                   <pic:spPr>
                     <a:xfrm>
                       <a:off x="0" y="0"/>
-                      <a:ext cx="6217920" cy="3495853"/>
+                      <a:ext cx="5669280" cy="3187395"/>
                     </a:xfrm>
                     <a:prstGeom prst="rect"/>
                   </pic:spPr>
@@ -839,7 +1376,7 @@
           <w:color w:val="46525D"/>
           <w:sz w:val="17"/>
         </w:rPr>
-        <w:t>Table 2. Scope of this artifact and established systems.</w:t>
+        <w:t>Table 3. Scope of this artifact and established systems.</w:t>
       </w:r>
     </w:p>
     <w:tbl>
@@ -1235,7 +1772,7 @@
           <w:color w:val="46525D"/>
           <w:sz w:val="17"/>
         </w:rPr>
-        <w:t>Table 3. Recorded model decisions and solver-check times.</w:t>
+        <w:t>Table 4. Recorded model decisions and solver-check times.</w:t>
       </w:r>
     </w:p>
     <w:tbl>
@@ -1948,7 +2485,7 @@
           <w:color w:val="46525D"/>
           <w:sz w:val="17"/>
         </w:rPr>
-        <w:t>Table 4. Decision targets for selected controls.</w:t>
+        <w:t>Table 5. Decision targets for selected controls.</w:t>
       </w:r>
     </w:p>
     <w:tbl>
@@ -2449,7 +2986,7 @@
           <w:color w:val="46525D"/>
           <w:sz w:val="17"/>
         </w:rPr>
-        <w:t>Table 5. Published pool reserves and a fee-free model counterfactual.</w:t>
+        <w:t>Table 6. Published pool reserves and a fee-free model counterfactual.</w:t>
       </w:r>
     </w:p>
     <w:tbl>
@@ -2884,7 +3421,7 @@
     <w:p>
       <w:pPr/>
       <w:r>
-        <w:t>To vary model size rather than merely repeat a fixed query, we generated 1, 2, 4, 8, 16, and 32 distinct pools with one symbolic A-to-B swap per pool. Initial pool reserves are 1000 A and 1000 B; the wallet begins with 1000 A. Each query first checks feasibility, then asks for a violation of total token conservation. Three fresh queries were run per size on Windows with Python 3.12.14 and Z3 5.1.0; Table 6 reports median end-to-end check times, including both solver checks but excluding model construction. All cases were feasible and the conservation counterexample was UNSAT.</w:t>
+        <w:t>To vary model size rather than merely repeat a fixed query, we generated 1, 2, 4, 8, 16, and 32 distinct pools with one symbolic A-to-B swap per pool. Initial pool reserves are 1000 A and 1000 B; the wallet begins with 1000 A. Each query first checks feasibility, then asks for a violation of total token conservation. Three fresh queries were run per size on Windows with Python 3.12.14 and Z3 5.1.0; Table 7 reports median end-to-end check times, including both solver checks but excluding model construction. All cases were feasible and the conservation counterexample was UNSAT.</w:t>
       </w:r>
     </w:p>
     <w:p>
@@ -2898,7 +3435,7 @@
           <w:color w:val="46525D"/>
           <w:sz w:val="17"/>
         </w:rPr>
-        <w:t>Table 6. Auxiliary DAG structural scaling; three fresh runs per size.</w:t>
+        <w:t>Table 7. Auxiliary DAG structural scaling; three fresh runs per size.</w:t>
       </w:r>
     </w:p>
     <w:tbl>
@@ -3497,7 +4034,9 @@
       </w:r>
     </w:p>
     <w:p>
-      <w:pPr/>
+      <w:pPr>
+        <w:keepLines/>
+      </w:pPr>
       <w:r>
         <w:t>Explicit accounting makes an oracle-driven lending failure checkable even when the AMM itself finishes at its starting reserves. In the fixed capped model, the maximum extraction is determined by a small finite set of candidate flash amounts. Conditional oracle, dynamic LTV, and depth bounds can exclude positive extraction. The implementation corroborates those classifications across 90 synthetic settings and a reserve-calibrated counterfactual. Extending the result to deployed systems requires a historical transaction replay, contract-level refinement, and matched comparison with existing tools.</w:t>
       </w:r>

</xml_diff>